<commit_message>
Se sube el programa solicitado en base a las intrucciones para la Serie Practica del Examen Parcial II del curso de Programación I, adicionalmente se adjuntan los archivos con las evidencias cuando el programa se estaba ejecutando.
</commit_message>
<xml_diff>
--- a/TareaIX_ManejoDeArchivos/Tarea IX - Manejo de Archivos.docx
+++ b/TareaIX_ManejoDeArchivos/Tarea IX - Manejo de Archivos.docx
@@ -313,15 +313,15 @@
           <w:sz w:val="28"/>
           <w:szCs w:val="28"/>
         </w:rPr>
-        <w:t>26</w:t>
-      </w:r>
-      <w:r>
-        <w:rPr>
-          <w:rFonts w:ascii="Century Gothic" w:hAnsi="Century Gothic"/>
-          <w:sz w:val="28"/>
-          <w:szCs w:val="28"/>
-        </w:rPr>
-        <w:t xml:space="preserve"> de abril del 202</w:t>
+        <w:t>26 de abril del 202</w:t>
+      </w:r>
+      <w:r>
+        <w:rPr>
+          <w:rFonts w:ascii="Century Gothic" w:hAnsi="Century Gothic"/>
+          <w:sz w:val="28"/>
+          <w:szCs w:val="28"/>
+        </w:rPr>
+        <w:t>6</w:t>
       </w:r>
     </w:p>
     <w:p>
@@ -342,6 +342,9 @@
     <w:p/>
     <w:p>
       <w:r>
+        <w:rPr>
+          <w:noProof/>
+        </w:rPr>
         <w:drawing>
           <wp:inline distT="0" distB="0" distL="0" distR="0" wp14:anchorId="2A08AFE6" wp14:editId="49AE5FEE">
             <wp:extent cx="9144000" cy="5380355"/>
@@ -385,6 +388,9 @@
     <w:p/>
     <w:p>
       <w:r>
+        <w:rPr>
+          <w:noProof/>
+        </w:rPr>
         <w:drawing>
           <wp:inline distT="0" distB="0" distL="0" distR="0" wp14:anchorId="5F45C06A" wp14:editId="4C82665F">
             <wp:extent cx="9144000" cy="5382260"/>
@@ -428,6 +434,9 @@
     <w:p/>
     <w:p>
       <w:r>
+        <w:rPr>
+          <w:noProof/>
+        </w:rPr>
         <w:drawing>
           <wp:inline distT="0" distB="0" distL="0" distR="0" wp14:anchorId="6BB3D31A" wp14:editId="51E6CE34">
             <wp:extent cx="9144000" cy="5375910"/>
@@ -1144,6 +1153,7 @@
   <w:style w:type="character" w:default="1" w:styleId="Fuentedeprrafopredeter">
     <w:name w:val="Default Paragraph Font"/>
     <w:uiPriority w:val="1"/>
+    <w:semiHidden/>
     <w:unhideWhenUsed/>
   </w:style>
   <w:style w:type="table" w:default="1" w:styleId="Tablanormal">

</xml_diff>